<commit_message>
made changes to vector.py
</commit_message>
<xml_diff>
--- a/Experiment.docx
+++ b/Experiment.docx
@@ -278,6 +278,15 @@
           <w:szCs w:val="26"/>
         </w:rPr>
         <w:t>MRR</w:t>
+      </w:r>
+      <w:r>
+        <w:rPr>
+          <w:b/>
+          <w:bCs/>
+          <w:sz w:val="26"/>
+          <w:szCs w:val="26"/>
+        </w:rPr>
+        <w:t xml:space="preserve"> (Mean reciprocal rating)</w:t>
       </w:r>
       <w:r>
         <w:rPr>

</xml_diff>